<commit_message>
fix: refactor a las consultas por cambios en la base de datos
</commit_message>
<xml_diff>
--- a/plantillas/notificacion-fin-contrato.docx
+++ b/plantillas/notificacion-fin-contrato.docx
@@ -26,8 +26,6 @@
                 <w:szCs w:val="20"/>
               </w:rPr>
             </w:pPr>
-            <w:bookmarkStart w:id="0" w:name="_GoBack"/>
-            <w:bookmarkEnd w:id="0"/>
             <w:r>
               <w:rPr>
                 <w:b/>
@@ -213,7 +211,27 @@
                 <w:sz w:val="20"/>
                 <w:szCs w:val="20"/>
               </w:rPr>
-              <w:t>{d.notificacion.redactor_iniciales}</w:t>
+              <w:t>{</w:t>
+            </w:r>
+            <w:proofErr w:type="spellStart"/>
+            <w:r>
+              <w:rPr>
+                <w:b/>
+                <w:noProof/>
+                <w:sz w:val="20"/>
+                <w:szCs w:val="20"/>
+              </w:rPr>
+              <w:t>d.notificacion.redactor_iniciales</w:t>
+            </w:r>
+            <w:proofErr w:type="spellEnd"/>
+            <w:r>
+              <w:rPr>
+                <w:b/>
+                <w:noProof/>
+                <w:sz w:val="20"/>
+                <w:szCs w:val="20"/>
+              </w:rPr>
+              <w:t>}</w:t>
             </w:r>
           </w:p>
         </w:tc>
@@ -358,28 +376,23 @@
           <w:rFonts w:ascii="Arial" w:hAnsi="Arial" w:cs="Arial"/>
           <w:szCs w:val="22"/>
         </w:rPr>
-        <w:t>S</w:t>
+        <w:t>{d.trabajador.sr_sra</w:t>
       </w:r>
       <w:r>
         <w:rPr>
           <w:rFonts w:ascii="Arial" w:hAnsi="Arial" w:cs="Arial"/>
           <w:szCs w:val="22"/>
         </w:rPr>
-        <w:t>R</w:t>
-      </w:r>
+        <w:t>}</w:t>
+      </w:r>
+      <w:bookmarkStart w:id="0" w:name="_GoBack"/>
+      <w:bookmarkEnd w:id="0"/>
       <w:r>
         <w:rPr>
           <w:rFonts w:ascii="Arial" w:hAnsi="Arial" w:cs="Arial"/>
           <w:szCs w:val="22"/>
         </w:rPr>
-        <w:t>{d.trabajador.genero_a}</w:t>
-      </w:r>
-      <w:r>
-        <w:rPr>
-          <w:rFonts w:ascii="Arial" w:hAnsi="Arial" w:cs="Arial"/>
-          <w:szCs w:val="22"/>
-        </w:rPr>
-        <w:t xml:space="preserve">. </w:t>
+        <w:t xml:space="preserve"> </w:t>
       </w:r>
       <w:r>
         <w:rPr>
@@ -451,7 +464,23 @@
           <w:rFonts w:ascii="Arial" w:hAnsi="Arial" w:cs="Arial"/>
           <w:noProof/>
         </w:rPr>
-        <w:t>{d.trabajador.dv}</w:t>
+        <w:t>{</w:t>
+      </w:r>
+      <w:proofErr w:type="spellStart"/>
+      <w:r>
+        <w:rPr>
+          <w:rFonts w:ascii="Arial" w:hAnsi="Arial" w:cs="Arial"/>
+          <w:noProof/>
+        </w:rPr>
+        <w:t>d.trabajador.dv</w:t>
+      </w:r>
+      <w:proofErr w:type="spellEnd"/>
+      <w:r>
+        <w:rPr>
+          <w:rFonts w:ascii="Arial" w:hAnsi="Arial" w:cs="Arial"/>
+          <w:noProof/>
+        </w:rPr>
+        <w:t>}</w:t>
       </w:r>
     </w:p>
     <w:p>
@@ -606,7 +635,23 @@
           <w:rFonts w:ascii="Arial" w:hAnsi="Arial" w:cs="Arial"/>
           <w:noProof/>
         </w:rPr>
-        <w:t>{d.notificacion.causal}</w:t>
+        <w:t>{</w:t>
+      </w:r>
+      <w:proofErr w:type="spellStart"/>
+      <w:r>
+        <w:rPr>
+          <w:rFonts w:ascii="Arial" w:hAnsi="Arial" w:cs="Arial"/>
+          <w:noProof/>
+        </w:rPr>
+        <w:t>d.notificacion.causal</w:t>
+      </w:r>
+      <w:proofErr w:type="spellEnd"/>
+      <w:r>
+        <w:rPr>
+          <w:rFonts w:ascii="Arial" w:hAnsi="Arial" w:cs="Arial"/>
+          <w:noProof/>
+        </w:rPr>
+        <w:t>}</w:t>
       </w:r>
       <w:r>
         <w:rPr>
@@ -799,7 +844,23 @@
           <w:rFonts w:ascii="Arial" w:hAnsi="Arial" w:cs="Arial"/>
           <w:b/>
         </w:rPr>
-        <w:t>{d.firmante.nombre}</w:t>
+        <w:t>{</w:t>
+      </w:r>
+      <w:proofErr w:type="spellStart"/>
+      <w:r>
+        <w:rPr>
+          <w:rFonts w:ascii="Arial" w:hAnsi="Arial" w:cs="Arial"/>
+          <w:b/>
+        </w:rPr>
+        <w:t>d.firmante.nombre</w:t>
+      </w:r>
+      <w:proofErr w:type="spellEnd"/>
+      <w:r>
+        <w:rPr>
+          <w:rFonts w:ascii="Arial" w:hAnsi="Arial" w:cs="Arial"/>
+          <w:b/>
+        </w:rPr>
+        <w:t>}</w:t>
       </w:r>
       <w:r>
         <w:rPr>
@@ -822,7 +883,23 @@
           <w:rFonts w:ascii="Arial" w:hAnsi="Arial" w:cs="Arial"/>
           <w:b/>
         </w:rPr>
-        <w:t>{d.firmante.cargo}</w:t>
+        <w:t>{</w:t>
+      </w:r>
+      <w:proofErr w:type="spellStart"/>
+      <w:r>
+        <w:rPr>
+          <w:rFonts w:ascii="Arial" w:hAnsi="Arial" w:cs="Arial"/>
+          <w:b/>
+        </w:rPr>
+        <w:t>d.firmante.cargo</w:t>
+      </w:r>
+      <w:proofErr w:type="spellEnd"/>
+      <w:r>
+        <w:rPr>
+          <w:rFonts w:ascii="Arial" w:hAnsi="Arial" w:cs="Arial"/>
+          <w:b/>
+        </w:rPr>
+        <w:t>}</w:t>
       </w:r>
     </w:p>
     <w:p>
@@ -845,7 +922,23 @@
           <w:rFonts w:ascii="Arial" w:hAnsi="Arial" w:cs="Arial"/>
           <w:b/>
         </w:rPr>
-        <w:t>{d.firmante.rut}</w:t>
+        <w:t>{</w:t>
+      </w:r>
+      <w:proofErr w:type="spellStart"/>
+      <w:r>
+        <w:rPr>
+          <w:rFonts w:ascii="Arial" w:hAnsi="Arial" w:cs="Arial"/>
+          <w:b/>
+        </w:rPr>
+        <w:t>d.firmante.rut</w:t>
+      </w:r>
+      <w:proofErr w:type="spellEnd"/>
+      <w:r>
+        <w:rPr>
+          <w:rFonts w:ascii="Arial" w:hAnsi="Arial" w:cs="Arial"/>
+          <w:b/>
+        </w:rPr>
+        <w:t>}</w:t>
       </w:r>
     </w:p>
     <w:p>
@@ -887,8 +980,13 @@
             <w:pPr>
               <w:jc w:val="center"/>
             </w:pPr>
-            <w:r>
-              <w:t>cc. Inspección del Trabajo</w:t>
+            <w:proofErr w:type="spellStart"/>
+            <w:r>
+              <w:t>cc.</w:t>
+            </w:r>
+            <w:proofErr w:type="spellEnd"/>
+            <w:r>
+              <w:t xml:space="preserve"> Inspección del Trabajo</w:t>
             </w:r>
           </w:p>
           <w:p>
@@ -931,7 +1029,15 @@
               <w:t xml:space="preserve"> TRABAJADOR</w:t>
             </w:r>
             <w:r>
-              <w:t>{d.trabajador.genero_a}</w:t>
+              <w:t>{</w:t>
+            </w:r>
+            <w:proofErr w:type="spellStart"/>
+            <w:r>
+              <w:t>d.trabajador.genero_a</w:t>
+            </w:r>
+            <w:proofErr w:type="spellEnd"/>
+            <w:r>
+              <w:t>}</w:t>
             </w:r>
             <w:r>
               <w:tab/>
@@ -1151,7 +1257,9 @@
   </w:style>
   <w:style w:type="character" w:default="1" w:styleId="Fuentedeprrafopredeter">
     <w:name w:val="Default Paragraph Font"/>
+    <w:uiPriority w:val="1"/>
     <w:semiHidden/>
+    <w:unhideWhenUsed/>
   </w:style>
   <w:style w:type="table" w:default="1" w:styleId="Tablanormal">
     <w:name w:val="Normal Table"/>
@@ -1200,6 +1308,196 @@
     <w:rPr>
       <w:lang w:val="es-ES"/>
     </w:rPr>
+  </w:style>
+</w:styles>
+</file>
+
+<file path=word/stylesWithEffects.xml><?xml version="1.0" encoding="utf-8"?>
+<w:styles xmlns:wpc="http://schemas.microsoft.com/office/word/2010/wordprocessingCanvas" xmlns:mc="http://schemas.openxmlformats.org/markup-compatibility/2006" xmlns:o="urn:schemas-microsoft-com:office:office" xmlns:r="http://schemas.openxmlformats.org/officeDocument/2006/relationships" xmlns:m="http://schemas.openxmlformats.org/officeDocument/2006/math" xmlns:v="urn:schemas-microsoft-com:vml" xmlns:wp14="http://schemas.microsoft.com/office/word/2010/wordprocessingDrawing" xmlns:wp="http://schemas.openxmlformats.org/drawingml/2006/wordprocessingDrawing" xmlns:w10="urn:schemas-microsoft-com:office:word" xmlns:w="http://schemas.openxmlformats.org/wordprocessingml/2006/main" xmlns:w14="http://schemas.microsoft.com/office/word/2010/wordml" xmlns:wpg="http://schemas.microsoft.com/office/word/2010/wordprocessingGroup" xmlns:wpi="http://schemas.microsoft.com/office/word/2010/wordprocessingInk" xmlns:wne="http://schemas.microsoft.com/office/word/2006/wordml" xmlns:wps="http://schemas.microsoft.com/office/word/2010/wordprocessingShape" mc:Ignorable="w14 wp14">
+  <w:docDefaults>
+    <w:rPrDefault>
+      <w:rPr>
+        <w:rFonts w:asciiTheme="minorHAnsi" w:eastAsiaTheme="minorEastAsia" w:hAnsiTheme="minorHAnsi" w:cstheme="minorBidi"/>
+        <w:sz w:val="22"/>
+        <w:szCs w:val="22"/>
+        <w:lang w:val="es-CL" w:eastAsia="es-CL" w:bidi="ar-SA"/>
+      </w:rPr>
+    </w:rPrDefault>
+    <w:pPrDefault>
+      <w:pPr>
+        <w:spacing w:after="200" w:line="276" w:lineRule="auto"/>
+      </w:pPr>
+    </w:pPrDefault>
+  </w:docDefaults>
+  <w:latentStyles w:defLockedState="0" w:defUIPriority="99" w:defSemiHidden="1" w:defUnhideWhenUsed="1" w:defQFormat="0" w:count="267">
+    <w:lsdException w:name="Normal" w:semiHidden="0" w:uiPriority="0" w:unhideWhenUsed="0" w:qFormat="1"/>
+    <w:lsdException w:name="heading 1" w:semiHidden="0" w:uiPriority="9" w:unhideWhenUsed="0" w:qFormat="1"/>
+    <w:lsdException w:name="heading 2" w:uiPriority="9" w:qFormat="1"/>
+    <w:lsdException w:name="heading 3" w:uiPriority="9" w:qFormat="1"/>
+    <w:lsdException w:name="heading 4" w:uiPriority="9" w:qFormat="1"/>
+    <w:lsdException w:name="heading 5" w:uiPriority="9" w:qFormat="1"/>
+    <w:lsdException w:name="heading 6" w:uiPriority="9" w:qFormat="1"/>
+    <w:lsdException w:name="heading 7" w:uiPriority="9" w:qFormat="1"/>
+    <w:lsdException w:name="heading 8" w:uiPriority="9" w:qFormat="1"/>
+    <w:lsdException w:name="heading 9" w:uiPriority="9" w:qFormat="1"/>
+    <w:lsdException w:name="toc 1" w:uiPriority="39"/>
+    <w:lsdException w:name="toc 2" w:uiPriority="39"/>
+    <w:lsdException w:name="toc 3" w:uiPriority="39"/>
+    <w:lsdException w:name="toc 4" w:uiPriority="39"/>
+    <w:lsdException w:name="toc 5" w:uiPriority="39"/>
+    <w:lsdException w:name="toc 6" w:uiPriority="39"/>
+    <w:lsdException w:name="toc 7" w:uiPriority="39"/>
+    <w:lsdException w:name="toc 8" w:uiPriority="39"/>
+    <w:lsdException w:name="toc 9" w:uiPriority="39"/>
+    <w:lsdException w:name="caption" w:uiPriority="35" w:qFormat="1"/>
+    <w:lsdException w:name="Title" w:semiHidden="0" w:uiPriority="10" w:unhideWhenUsed="0" w:qFormat="1"/>
+    <w:lsdException w:name="Default Paragraph Font" w:uiPriority="1"/>
+    <w:lsdException w:name="Subtitle" w:semiHidden="0" w:uiPriority="11" w:unhideWhenUsed="0" w:qFormat="1"/>
+    <w:lsdException w:name="Strong" w:semiHidden="0" w:uiPriority="22" w:unhideWhenUsed="0" w:qFormat="1"/>
+    <w:lsdException w:name="Emphasis" w:semiHidden="0" w:uiPriority="20" w:unhideWhenUsed="0" w:qFormat="1"/>
+    <w:lsdException w:name="Table Grid" w:semiHidden="0" w:uiPriority="59" w:unhideWhenUsed="0"/>
+    <w:lsdException w:name="Placeholder Text" w:unhideWhenUsed="0"/>
+    <w:lsdException w:name="No Spacing" w:semiHidden="0" w:uiPriority="1" w:unhideWhenUsed="0" w:qFormat="1"/>
+    <w:lsdException w:name="Light Shading" w:semiHidden="0" w:uiPriority="60" w:unhideWhenUsed="0"/>
+    <w:lsdException w:name="Light List" w:semiHidden="0" w:uiPriority="61" w:unhideWhenUsed="0"/>
+    <w:lsdException w:name="Light Grid" w:semiHidden="0" w:uiPriority="62" w:unhideWhenUsed="0"/>
+    <w:lsdException w:name="Medium Shading 1" w:semiHidden="0" w:uiPriority="63" w:unhideWhenUsed="0"/>
+    <w:lsdException w:name="Medium Shading 2" w:semiHidden="0" w:uiPriority="64" w:unhideWhenUsed="0"/>
+    <w:lsdException w:name="Medium List 1" w:semiHidden="0" w:uiPriority="65" w:unhideWhenUsed="0"/>
+    <w:lsdException w:name="Medium List 2" w:semiHidden="0" w:uiPriority="66" w:unhideWhenUsed="0"/>
+    <w:lsdException w:name="Medium Grid 1" w:semiHidden="0" w:uiPriority="67" w:unhideWhenUsed="0"/>
+    <w:lsdException w:name="Medium Grid 2" w:semiHidden="0" w:uiPriority="68" w:unhideWhenUsed="0"/>
+    <w:lsdException w:name="Medium Grid 3" w:semiHidden="0" w:uiPriority="69" w:unhideWhenUsed="0"/>
+    <w:lsdException w:name="Dark List" w:semiHidden="0" w:uiPriority="70" w:unhideWhenUsed="0"/>
+    <w:lsdException w:name="Colorful Shading" w:semiHidden="0" w:uiPriority="71" w:unhideWhenUsed="0"/>
+    <w:lsdException w:name="Colorful List" w:semiHidden="0" w:uiPriority="72" w:unhideWhenUsed="0"/>
+    <w:lsdException w:name="Colorful Grid" w:semiHidden="0" w:uiPriority="73" w:unhideWhenUsed="0"/>
+    <w:lsdException w:name="Light Shading Accent 1" w:semiHidden="0" w:uiPriority="60" w:unhideWhenUsed="0"/>
+    <w:lsdException w:name="Light List Accent 1" w:semiHidden="0" w:uiPriority="61" w:unhideWhenUsed="0"/>
+    <w:lsdException w:name="Light Grid Accent 1" w:semiHidden="0" w:uiPriority="62" w:unhideWhenUsed="0"/>
+    <w:lsdException w:name="Medium Shading 1 Accent 1" w:semiHidden="0" w:uiPriority="63" w:unhideWhenUsed="0"/>
+    <w:lsdException w:name="Medium Shading 2 Accent 1" w:semiHidden="0" w:uiPriority="64" w:unhideWhenUsed="0"/>
+    <w:lsdException w:name="Medium List 1 Accent 1" w:semiHidden="0" w:uiPriority="65" w:unhideWhenUsed="0"/>
+    <w:lsdException w:name="Revision" w:unhideWhenUsed="0"/>
+    <w:lsdException w:name="List Paragraph" w:semiHidden="0" w:uiPriority="34" w:unhideWhenUsed="0" w:qFormat="1"/>
+    <w:lsdException w:name="Quote" w:semiHidden="0" w:uiPriority="29" w:unhideWhenUsed="0" w:qFormat="1"/>
+    <w:lsdException w:name="Intense Quote" w:semiHidden="0" w:uiPriority="30" w:unhideWhenUsed="0" w:qFormat="1"/>
+    <w:lsdException w:name="Medium List 2 Accent 1" w:semiHidden="0" w:uiPriority="66" w:unhideWhenUsed="0"/>
+    <w:lsdException w:name="Medium Grid 1 Accent 1" w:semiHidden="0" w:uiPriority="67" w:unhideWhenUsed="0"/>
+    <w:lsdException w:name="Medium Grid 2 Accent 1" w:semiHidden="0" w:uiPriority="68" w:unhideWhenUsed="0"/>
+    <w:lsdException w:name="Medium Grid 3 Accent 1" w:semiHidden="0" w:uiPriority="69" w:unhideWhenUsed="0"/>
+    <w:lsdException w:name="Dark List Accent 1" w:semiHidden="0" w:uiPriority="70" w:unhideWhenUsed="0"/>
+    <w:lsdException w:name="Colorful Shading Accent 1" w:semiHidden="0" w:uiPriority="71" w:unhideWhenUsed="0"/>
+    <w:lsdException w:name="Colorful List Accent 1" w:semiHidden="0" w:uiPriority="72" w:unhideWhenUsed="0"/>
+    <w:lsdException w:name="Colorful Grid Accent 1" w:semiHidden="0" w:uiPriority="73" w:unhideWhenUsed="0"/>
+    <w:lsdException w:name="Light Shading Accent 2" w:semiHidden="0" w:uiPriority="60" w:unhideWhenUsed="0"/>
+    <w:lsdException w:name="Light List Accent 2" w:semiHidden="0" w:uiPriority="61" w:unhideWhenUsed="0"/>
+    <w:lsdException w:name="Light Grid Accent 2" w:semiHidden="0" w:uiPriority="62" w:unhideWhenUsed="0"/>
+    <w:lsdException w:name="Medium Shading 1 Accent 2" w:semiHidden="0" w:uiPriority="63" w:unhideWhenUsed="0"/>
+    <w:lsdException w:name="Medium Shading 2 Accent 2" w:semiHidden="0" w:uiPriority="64" w:unhideWhenUsed="0"/>
+    <w:lsdException w:name="Medium List 1 Accent 2" w:semiHidden="0" w:uiPriority="65" w:unhideWhenUsed="0"/>
+    <w:lsdException w:name="Medium List 2 Accent 2" w:semiHidden="0" w:uiPriority="66" w:unhideWhenUsed="0"/>
+    <w:lsdException w:name="Medium Grid 1 Accent 2" w:semiHidden="0" w:uiPriority="67" w:unhideWhenUsed="0"/>
+    <w:lsdException w:name="Medium Grid 2 Accent 2" w:semiHidden="0" w:uiPriority="68" w:unhideWhenUsed="0"/>
+    <w:lsdException w:name="Medium Grid 3 Accent 2" w:semiHidden="0" w:uiPriority="69" w:unhideWhenUsed="0"/>
+    <w:lsdException w:name="Dark List Accent 2" w:semiHidden="0" w:uiPriority="70" w:unhideWhenUsed="0"/>
+    <w:lsdException w:name="Colorful Shading Accent 2" w:semiHidden="0" w:uiPriority="71" w:unhideWhenUsed="0"/>
+    <w:lsdException w:name="Colorful List Accent 2" w:semiHidden="0" w:uiPriority="72" w:unhideWhenUsed="0"/>
+    <w:lsdException w:name="Colorful Grid Accent 2" w:semiHidden="0" w:uiPriority="73" w:unhideWhenUsed="0"/>
+    <w:lsdException w:name="Light Shading Accent 3" w:semiHidden="0" w:uiPriority="60" w:unhideWhenUsed="0"/>
+    <w:lsdException w:name="Light List Accent 3" w:semiHidden="0" w:uiPriority="61" w:unhideWhenUsed="0"/>
+    <w:lsdException w:name="Light Grid Accent 3" w:semiHidden="0" w:uiPriority="62" w:unhideWhenUsed="0"/>
+    <w:lsdException w:name="Medium Shading 1 Accent 3" w:semiHidden="0" w:uiPriority="63" w:unhideWhenUsed="0"/>
+    <w:lsdException w:name="Medium Shading 2 Accent 3" w:semiHidden="0" w:uiPriority="64" w:unhideWhenUsed="0"/>
+    <w:lsdException w:name="Medium List 1 Accent 3" w:semiHidden="0" w:uiPriority="65" w:unhideWhenUsed="0"/>
+    <w:lsdException w:name="Medium List 2 Accent 3" w:semiHidden="0" w:uiPriority="66" w:unhideWhenUsed="0"/>
+    <w:lsdException w:name="Medium Grid 1 Accent 3" w:semiHidden="0" w:uiPriority="67" w:unhideWhenUsed="0"/>
+    <w:lsdException w:name="Medium Grid 2 Accent 3" w:semiHidden="0" w:uiPriority="68" w:unhideWhenUsed="0"/>
+    <w:lsdException w:name="Medium Grid 3 Accent 3" w:semiHidden="0" w:uiPriority="69" w:unhideWhenUsed="0"/>
+    <w:lsdException w:name="Dark List Accent 3" w:semiHidden="0" w:uiPriority="70" w:unhideWhenUsed="0"/>
+    <w:lsdException w:name="Colorful Shading Accent 3" w:semiHidden="0" w:uiPriority="71" w:unhideWhenUsed="0"/>
+    <w:lsdException w:name="Colorful List Accent 3" w:semiHidden="0" w:uiPriority="72" w:unhideWhenUsed="0"/>
+    <w:lsdException w:name="Colorful Grid Accent 3" w:semiHidden="0" w:uiPriority="73" w:unhideWhenUsed="0"/>
+    <w:lsdException w:name="Light Shading Accent 4" w:semiHidden="0" w:uiPriority="60" w:unhideWhenUsed="0"/>
+    <w:lsdException w:name="Light List Accent 4" w:semiHidden="0" w:uiPriority="61" w:unhideWhenUsed="0"/>
+    <w:lsdException w:name="Light Grid Accent 4" w:semiHidden="0" w:uiPriority="62" w:unhideWhenUsed="0"/>
+    <w:lsdException w:name="Medium Shading 1 Accent 4" w:semiHidden="0" w:uiPriority="63" w:unhideWhenUsed="0"/>
+    <w:lsdException w:name="Medium Shading 2 Accent 4" w:semiHidden="0" w:uiPriority="64" w:unhideWhenUsed="0"/>
+    <w:lsdException w:name="Medium List 1 Accent 4" w:semiHidden="0" w:uiPriority="65" w:unhideWhenUsed="0"/>
+    <w:lsdException w:name="Medium List 2 Accent 4" w:semiHidden="0" w:uiPriority="66" w:unhideWhenUsed="0"/>
+    <w:lsdException w:name="Medium Grid 1 Accent 4" w:semiHidden="0" w:uiPriority="67" w:unhideWhenUsed="0"/>
+    <w:lsdException w:name="Medium Grid 2 Accent 4" w:semiHidden="0" w:uiPriority="68" w:unhideWhenUsed="0"/>
+    <w:lsdException w:name="Medium Grid 3 Accent 4" w:semiHidden="0" w:uiPriority="69" w:unhideWhenUsed="0"/>
+    <w:lsdException w:name="Dark List Accent 4" w:semiHidden="0" w:uiPriority="70" w:unhideWhenUsed="0"/>
+    <w:lsdException w:name="Colorful Shading Accent 4" w:semiHidden="0" w:uiPriority="71" w:unhideWhenUsed="0"/>
+    <w:lsdException w:name="Colorful List Accent 4" w:semiHidden="0" w:uiPriority="72" w:unhideWhenUsed="0"/>
+    <w:lsdException w:name="Colorful Grid Accent 4" w:semiHidden="0" w:uiPriority="73" w:unhideWhenUsed="0"/>
+    <w:lsdException w:name="Light Shading Accent 5" w:semiHidden="0" w:uiPriority="60" w:unhideWhenUsed="0"/>
+    <w:lsdException w:name="Light List Accent 5" w:semiHidden="0" w:uiPriority="61" w:unhideWhenUsed="0"/>
+    <w:lsdException w:name="Light Grid Accent 5" w:semiHidden="0" w:uiPriority="62" w:unhideWhenUsed="0"/>
+    <w:lsdException w:name="Medium Shading 1 Accent 5" w:semiHidden="0" w:uiPriority="63" w:unhideWhenUsed="0"/>
+    <w:lsdException w:name="Medium Shading 2 Accent 5" w:semiHidden="0" w:uiPriority="64" w:unhideWhenUsed="0"/>
+    <w:lsdException w:name="Medium List 1 Accent 5" w:semiHidden="0" w:uiPriority="65" w:unhideWhenUsed="0"/>
+    <w:lsdException w:name="Medium List 2 Accent 5" w:semiHidden="0" w:uiPriority="66" w:unhideWhenUsed="0"/>
+    <w:lsdException w:name="Medium Grid 1 Accent 5" w:semiHidden="0" w:uiPriority="67" w:unhideWhenUsed="0"/>
+    <w:lsdException w:name="Medium Grid 2 Accent 5" w:semiHidden="0" w:uiPriority="68" w:unhideWhenUsed="0"/>
+    <w:lsdException w:name="Medium Grid 3 Accent 5" w:semiHidden="0" w:uiPriority="69" w:unhideWhenUsed="0"/>
+    <w:lsdException w:name="Dark List Accent 5" w:semiHidden="0" w:uiPriority="70" w:unhideWhenUsed="0"/>
+    <w:lsdException w:name="Colorful Shading Accent 5" w:semiHidden="0" w:uiPriority="71" w:unhideWhenUsed="0"/>
+    <w:lsdException w:name="Colorful List Accent 5" w:semiHidden="0" w:uiPriority="72" w:unhideWhenUsed="0"/>
+    <w:lsdException w:name="Colorful Grid Accent 5" w:semiHidden="0" w:uiPriority="73" w:unhideWhenUsed="0"/>
+    <w:lsdException w:name="Light Shading Accent 6" w:semiHidden="0" w:uiPriority="60" w:unhideWhenUsed="0"/>
+    <w:lsdException w:name="Light List Accent 6" w:semiHidden="0" w:uiPriority="61" w:unhideWhenUsed="0"/>
+    <w:lsdException w:name="Light Grid Accent 6" w:semiHidden="0" w:uiPriority="62" w:unhideWhenUsed="0"/>
+    <w:lsdException w:name="Medium Shading 1 Accent 6" w:semiHidden="0" w:uiPriority="63" w:unhideWhenUsed="0"/>
+    <w:lsdException w:name="Medium Shading 2 Accent 6" w:semiHidden="0" w:uiPriority="64" w:unhideWhenUsed="0"/>
+    <w:lsdException w:name="Medium List 1 Accent 6" w:semiHidden="0" w:uiPriority="65" w:unhideWhenUsed="0"/>
+    <w:lsdException w:name="Medium List 2 Accent 6" w:semiHidden="0" w:uiPriority="66" w:unhideWhenUsed="0"/>
+    <w:lsdException w:name="Medium Grid 1 Accent 6" w:semiHidden="0" w:uiPriority="67" w:unhideWhenUsed="0"/>
+    <w:lsdException w:name="Medium Grid 2 Accent 6" w:semiHidden="0" w:uiPriority="68" w:unhideWhenUsed="0"/>
+    <w:lsdException w:name="Medium Grid 3 Accent 6" w:semiHidden="0" w:uiPriority="69" w:unhideWhenUsed="0"/>
+    <w:lsdException w:name="Dark List Accent 6" w:semiHidden="0" w:uiPriority="70" w:unhideWhenUsed="0"/>
+    <w:lsdException w:name="Colorful Shading Accent 6" w:semiHidden="0" w:uiPriority="71" w:unhideWhenUsed="0"/>
+    <w:lsdException w:name="Colorful List Accent 6" w:semiHidden="0" w:uiPriority="72" w:unhideWhenUsed="0"/>
+    <w:lsdException w:name="Colorful Grid Accent 6" w:semiHidden="0" w:uiPriority="73" w:unhideWhenUsed="0"/>
+    <w:lsdException w:name="Subtle Emphasis" w:semiHidden="0" w:uiPriority="19" w:unhideWhenUsed="0" w:qFormat="1"/>
+    <w:lsdException w:name="Intense Emphasis" w:semiHidden="0" w:uiPriority="21" w:unhideWhenUsed="0" w:qFormat="1"/>
+    <w:lsdException w:name="Subtle Reference" w:semiHidden="0" w:uiPriority="31" w:unhideWhenUsed="0" w:qFormat="1"/>
+    <w:lsdException w:name="Intense Reference" w:semiHidden="0" w:uiPriority="32" w:unhideWhenUsed="0" w:qFormat="1"/>
+    <w:lsdException w:name="Book Title" w:semiHidden="0" w:uiPriority="33" w:unhideWhenUsed="0" w:qFormat="1"/>
+    <w:lsdException w:name="Bibliography" w:uiPriority="37"/>
+    <w:lsdException w:name="TOC Heading" w:uiPriority="39" w:qFormat="1"/>
+  </w:latentStyles>
+  <w:style w:type="paragraph" w:default="1" w:styleId="Normal">
+    <w:name w:val="Normal"/>
+    <w:qFormat/>
+  </w:style>
+  <w:style w:type="character" w:default="1" w:styleId="Fuentedeprrafopredeter">
+    <w:name w:val="Default Paragraph Font"/>
+    <w:uiPriority w:val="1"/>
+    <w:semiHidden/>
+    <w:unhideWhenUsed/>
+  </w:style>
+  <w:style w:type="table" w:default="1" w:styleId="Tablanormal">
+    <w:name w:val="Normal Table"/>
+    <w:uiPriority w:val="99"/>
+    <w:semiHidden/>
+    <w:unhideWhenUsed/>
+    <w:tblPr>
+      <w:tblInd w:w="0" w:type="dxa"/>
+      <w:tblCellMar>
+        <w:top w:w="0" w:type="dxa"/>
+        <w:left w:w="108" w:type="dxa"/>
+        <w:bottom w:w="0" w:type="dxa"/>
+        <w:right w:w="108" w:type="dxa"/>
+      </w:tblCellMar>
+    </w:tblPr>
+  </w:style>
+  <w:style w:type="numbering" w:default="1" w:styleId="Sinlista">
+    <w:name w:val="No List"/>
+    <w:uiPriority w:val="99"/>
+    <w:semiHidden/>
+    <w:unhideWhenUsed/>
   </w:style>
 </w:styles>
 </file>

</xml_diff>